<commit_message>
Khoi phuc luu do tong quat ban sinh vien o ca 2 quyen lap trinh; xoa dong huong dan sot
Co-authored-by: arena-agent <297053741+arena-agent@users.noreply.github.com>
</commit_message>
<xml_diff>
--- a/Bao_cao_1_truc_Lap_trinh.docx
+++ b/Bao_cao_1_truc_Lap_trinh.docx
@@ -2907,7 +2907,7 @@
       <w:r>
         <w:drawing>
           <wp:inline distT="0" distB="0" distL="0" distR="0" wp14:anchorId="5E109939" wp14:editId="1154E240">
-            <wp:extent cx="5669280" cy="7138490"/>
+            <wp:extent cx="5303520" cy="4882358"/>
             <wp:effectExtent l="0" t="0" r="635" b="0"/>
             <wp:docPr id="1" name="Picture 1"/>
             <wp:cNvGraphicFramePr>
@@ -2929,7 +2929,7 @@
                   <pic:spPr>
                     <a:xfrm>
                       <a:off x="0" y="0"/>
-                      <a:ext cx="5669280" cy="7138490"/>
+                      <a:ext cx="5303520" cy="4882358"/>
                     </a:xfrm>
                     <a:prstGeom prst="rect">
                       <a:avLst/>
@@ -2950,7 +2950,7 @@
         <w:rPr>
           <w:color w:val="000000"/>
         </w:rPr>
-        <w:t>Hình 6. Lưu đồ tổng quát chương trình hybrid một trục</w:t>
+        <w:t>Hình 6. Lưu đồ tổng quát chương trình hybrid một trục (bản vẽ của sinh viên)</w:t>
       </w:r>
       <w:proofErr w:type="spellStart"/>
       <w:proofErr w:type="spellEnd"/>
@@ -3702,250 +3702,6 @@
       <w:r>
         <w:t xml:space="preserve"> </w:t>
       </w:r>
-    </w:p>
-    <w:p>
-      <w:pPr>
-        <w:pStyle w:val="ListBullet"/>
-        <w:numPr>
-          <w:ilvl w:val="0"/>
-          <w:numId w:val="0"/>
-        </w:numPr>
-        <w:rPr>
-          <w:color w:val="FF0000"/>
-        </w:rPr>
-      </w:pPr>
-      <w:proofErr w:type="spellStart"/>
-      <w:r>
-        <w:rPr>
-          <w:color w:val="000000"/>
-        </w:rPr>
-        <w:t>Ghi</w:t>
-      </w:r>
-      <w:proofErr w:type="spellEnd"/>
-      <w:r>
-        <w:rPr>
-          <w:color w:val="000000"/>
-        </w:rPr>
-        <w:t xml:space="preserve"> them </w:t>
-      </w:r>
-      <w:proofErr w:type="spellStart"/>
-      <w:r>
-        <w:rPr>
-          <w:color w:val="000000"/>
-        </w:rPr>
-        <w:t>các</w:t>
-      </w:r>
-      <w:proofErr w:type="spellEnd"/>
-      <w:r>
-        <w:rPr>
-          <w:color w:val="000000"/>
-        </w:rPr>
-        <w:t xml:space="preserve"> </w:t>
-      </w:r>
-      <w:proofErr w:type="spellStart"/>
-      <w:r>
-        <w:rPr>
-          <w:color w:val="000000"/>
-        </w:rPr>
-        <w:t>công</w:t>
-      </w:r>
-      <w:proofErr w:type="spellEnd"/>
-      <w:r>
-        <w:rPr>
-          <w:color w:val="000000"/>
-        </w:rPr>
-        <w:t xml:space="preserve"> </w:t>
-      </w:r>
-      <w:proofErr w:type="spellStart"/>
-      <w:r>
-        <w:rPr>
-          <w:color w:val="000000"/>
-        </w:rPr>
-        <w:t>việc</w:t>
-      </w:r>
-      <w:proofErr w:type="spellEnd"/>
-      <w:r>
-        <w:rPr>
-          <w:color w:val="000000"/>
-        </w:rPr>
-        <w:t xml:space="preserve"> </w:t>
-      </w:r>
-      <w:proofErr w:type="spellStart"/>
-      <w:r>
-        <w:rPr>
-          <w:color w:val="000000"/>
-        </w:rPr>
-        <w:t>theo</w:t>
-      </w:r>
-      <w:proofErr w:type="spellEnd"/>
-      <w:r>
-        <w:rPr>
-          <w:color w:val="000000"/>
-        </w:rPr>
-        <w:t xml:space="preserve"> </w:t>
-      </w:r>
-      <w:proofErr w:type="spellStart"/>
-      <w:r>
-        <w:rPr>
-          <w:color w:val="000000"/>
-        </w:rPr>
-        <w:t>thưc</w:t>
-      </w:r>
-      <w:proofErr w:type="spellEnd"/>
-      <w:r>
-        <w:rPr>
-          <w:color w:val="000000"/>
-        </w:rPr>
-        <w:t xml:space="preserve"> </w:t>
-      </w:r>
-      <w:proofErr w:type="spellStart"/>
-      <w:r>
-        <w:rPr>
-          <w:color w:val="000000"/>
-        </w:rPr>
-        <w:t>tế</w:t>
-      </w:r>
-      <w:proofErr w:type="spellEnd"/>
-      <w:r>
-        <w:rPr>
-          <w:color w:val="000000"/>
-        </w:rPr>
-        <w:t xml:space="preserve"> </w:t>
-      </w:r>
-      <w:proofErr w:type="spellStart"/>
-      <w:r>
-        <w:rPr>
-          <w:color w:val="000000"/>
-        </w:rPr>
-        <w:t>cho</w:t>
-      </w:r>
-      <w:proofErr w:type="spellEnd"/>
-      <w:r>
-        <w:rPr>
-          <w:color w:val="000000"/>
-        </w:rPr>
-        <w:t xml:space="preserve"> </w:t>
-      </w:r>
-      <w:proofErr w:type="spellStart"/>
-      <w:r>
-        <w:rPr>
-          <w:color w:val="000000"/>
-        </w:rPr>
-        <w:t>tôi</w:t>
-      </w:r>
-      <w:proofErr w:type="spellEnd"/>
-      <w:r>
-        <w:rPr>
-          <w:color w:val="000000"/>
-        </w:rPr>
-        <w:t xml:space="preserve"> </w:t>
-      </w:r>
-      <w:proofErr w:type="spellStart"/>
-      <w:r>
-        <w:rPr>
-          <w:color w:val="000000"/>
-        </w:rPr>
-        <w:t>nhớ</w:t>
-      </w:r>
-      <w:proofErr w:type="spellEnd"/>
-      <w:r>
-        <w:rPr>
-          <w:color w:val="000000"/>
-        </w:rPr>
-        <w:t xml:space="preserve"> </w:t>
-      </w:r>
-      <w:proofErr w:type="spellStart"/>
-      <w:r>
-        <w:rPr>
-          <w:color w:val="000000"/>
-        </w:rPr>
-        <w:t>đồng</w:t>
-      </w:r>
-      <w:proofErr w:type="spellEnd"/>
-      <w:r>
-        <w:rPr>
-          <w:color w:val="000000"/>
-        </w:rPr>
-        <w:t xml:space="preserve"> </w:t>
-      </w:r>
-      <w:proofErr w:type="spellStart"/>
-      <w:r>
-        <w:rPr>
-          <w:color w:val="000000"/>
-        </w:rPr>
-        <w:t>bộ</w:t>
-      </w:r>
-      <w:proofErr w:type="spellEnd"/>
-      <w:r>
-        <w:rPr>
-          <w:color w:val="000000"/>
-        </w:rPr>
-        <w:t xml:space="preserve"> </w:t>
-      </w:r>
-      <w:proofErr w:type="spellStart"/>
-      <w:r>
-        <w:rPr>
-          <w:color w:val="000000"/>
-        </w:rPr>
-        <w:t>với</w:t>
-      </w:r>
-      <w:proofErr w:type="spellEnd"/>
-      <w:r>
-        <w:rPr>
-          <w:color w:val="000000"/>
-        </w:rPr>
-        <w:t xml:space="preserve"> </w:t>
-      </w:r>
-      <w:proofErr w:type="spellStart"/>
-      <w:r>
-        <w:rPr>
-          <w:color w:val="000000"/>
-        </w:rPr>
-        <w:t>các</w:t>
-      </w:r>
-      <w:proofErr w:type="spellEnd"/>
-      <w:r>
-        <w:rPr>
-          <w:color w:val="000000"/>
-        </w:rPr>
-        <w:t xml:space="preserve"> </w:t>
-      </w:r>
-      <w:proofErr w:type="spellStart"/>
-      <w:r>
-        <w:rPr>
-          <w:color w:val="000000"/>
-        </w:rPr>
-        <w:t>báo</w:t>
-      </w:r>
-      <w:proofErr w:type="spellEnd"/>
-      <w:r>
-        <w:rPr>
-          <w:color w:val="000000"/>
-        </w:rPr>
-        <w:t xml:space="preserve"> </w:t>
-      </w:r>
-      <w:proofErr w:type="spellStart"/>
-      <w:r>
-        <w:rPr>
-          <w:color w:val="000000"/>
-        </w:rPr>
-        <w:t>cáo</w:t>
-      </w:r>
-      <w:proofErr w:type="spellEnd"/>
-      <w:r>
-        <w:rPr>
-          <w:color w:val="000000"/>
-        </w:rPr>
-        <w:t xml:space="preserve"> </w:t>
-      </w:r>
-      <w:proofErr w:type="spellStart"/>
-      <w:r>
-        <w:rPr>
-          <w:color w:val="000000"/>
-        </w:rPr>
-        <w:t>khác</w:t>
-      </w:r>
-      <w:proofErr w:type="spellEnd"/>
     </w:p>
     <w:p>
       <w:pPr>

</xml_diff>

<commit_message>
Sua toan bo phan kiem chung thanh gia tri tham kho, se kiem chung lai; dung lai PDF
Co-authored-by: arena-agent <297053741+arena-agent@users.noreply.github.com>
</commit_message>
<xml_diff>
--- a/Bao_cao_1_truc_Lap_trinh.docx
+++ b/Bao_cao_1_truc_Lap_trinh.docx
@@ -2251,7 +2251,7 @@
       </w:pPr>
       <w:r>
         <w:rPr/>
-        <w:t>Hoàn thành hàn khối nguồn: kiểm tra 3,3 V và 5 V trước khi cắm module, tránh phá ESP32 và LCD.</w:t>
+        <w:t>Hoàn thành hàn khối nguồn; việc đo kiểm 3,3 V và 5 V ở đầu ra sẽ thực hiện trước khi cắm module, tránh phá ESP32 và LCD.</w:t>
       </w:r>
     </w:p>
     <w:p>
@@ -2260,7 +2260,7 @@
       </w:pPr>
       <w:r>
         <w:rPr/>
-        <w:t>Hoàn thành hàn cầu H bốn TIP41C kèm tản nhiệt và diode bảo vệ; thử bảng trạng thái bằng nguồn giả.</w:t>
+        <w:t>Hoàn thành hàn cầu H bốn TIP41C kèm tản nhiệt và diode bảo vệ; việc thử bảng trạng thái bằng nguồn bench sẽ thực hiện khi cấp điện.</w:t>
       </w:r>
     </w:p>
     <w:p>
@@ -2269,7 +2269,7 @@
       </w:pPr>
       <w:r>
         <w:rPr/>
-        <w:t>Hoàn thành hàn mạch opto; đo kiểm: chân lệnh ESP32 xuống LOW thì đầu ra opto sụt về gần 0 V trên mass 12 V.</w:t>
+        <w:t>Hoàn thành hàn mạch opto; phép đo kiểm chân lệnh xuống LOW thì đầu ra opto sụt về gần 0 V sẽ thực hiện khi cấp điện.</w:t>
       </w:r>
     </w:p>
     <w:p>

</xml_diff>